<commit_message>
Session 7: practical guide to agents at work, policy v0.2, and agent slides
New #/guia-agentes take-away guide: rule of two, real incidents with
controls, autonomy ladder, the four tasks the cohort asked for (public
data scraping, internal reports to a database, simulation decks,
monitoring dashboards) with safe architectures, what other energy
companies did, frameworks, a 90-day roadmap and a ten-question
checklist. Five new diagrams.

Session 7 page and deck gain an agents section, EchoLeak and
postmark-mcp incidents and the 2025 CISA OT principles, within the same
20-minute block. Usage policy moves to v0.2 with a section on agents.

The ARCH domain served a gambling page on 2026-09-30, so the resource
links now point to the course copy of a daily report. iso.org joins the
link checker's anti-bot list.

Co-Authored-By: Claude Opus 5.5 <noreply@anthropic.com>
</commit_message>
<xml_diff>
--- a/public/descargas/politica-uso-ia-borrador.docx
+++ b/public/descargas/politica-uso-ia-borrador.docx
@@ -2,7 +2,7 @@
 <file path=word/document.xml><?xml version="1.0" encoding="utf-8"?>
 <w:document xmlns:w="http://schemas.openxmlformats.org/wordprocessingml/2006/main" xmlns:m="http://schemas.openxmlformats.org/officeDocument/2006/math" xmlns:r="http://schemas.openxmlformats.org/officeDocument/2006/relationships" xmlns:o="urn:schemas-microsoft-com:office:office" xmlns:v="urn:schemas-microsoft-com:vml" xmlns:w10="urn:schemas-microsoft-com:office:word" xmlns:a="http://schemas.openxmlformats.org/drawingml/2006/main" xmlns:pic="http://schemas.openxmlformats.org/drawingml/2006/picture" xmlns:wp="http://schemas.openxmlformats.org/drawingml/2006/wordprocessingDrawing">
   <w:body>
-    <w:bookmarkStart w:id="14" w:name="X7df5806eb35dfa18c85286f5cf7b28e257b5b55"/>
+    <w:bookmarkStart w:id="15" w:name="X7df5806eb35dfa18c85286f5cf7b28e257b5b55"/>
     <w:p>
       <w:pPr>
         <w:pStyle w:val="Heading1"/>
@@ -20,7 +20,7 @@
           <w:b/>
           <w:bCs/>
         </w:rPr>
-        <w:t xml:space="preserve">[Gerencia / equipo] · Versión 0.1 · [fecha]</w:t>
+        <w:t xml:space="preserve">[Gerencia / equipo] · Versión 0.2 · [fecha]</w:t>
       </w:r>
     </w:p>
     <w:p>
@@ -409,13 +409,13 @@
       </w:r>
     </w:p>
     <w:bookmarkEnd w:id="12"/>
-    <w:bookmarkStart w:id="13" w:name="casos-nuevos-y-agentes"/>
+    <w:bookmarkStart w:id="13" w:name="casos-nuevos"/>
     <w:p>
       <w:pPr>
         <w:pStyle w:val="Heading2"/>
       </w:pPr>
       <w:r>
-        <w:t xml:space="preserve">5. Casos nuevos y agentes</w:t>
+        <w:t xml:space="preserve">5. Casos nuevos</w:t>
       </w:r>
     </w:p>
     <w:p>
@@ -449,28 +449,59 @@
         <w:t xml:space="preserve">incorpora a la versión siguiente.</w:t>
       </w:r>
     </w:p>
+    <w:bookmarkEnd w:id="13"/>
+    <w:bookmarkStart w:id="14" w:name="agentes"/>
+    <w:p>
+      <w:pPr>
+        <w:pStyle w:val="Heading2"/>
+      </w:pPr>
+      <w:r>
+        <w:t xml:space="preserve">6. Agentes</w:t>
+      </w:r>
+    </w:p>
+    <w:p>
+      <w:pPr>
+        <w:pStyle w:val="FirstParagraph"/>
+      </w:pPr>
+      <w:r>
+        <w:t xml:space="preserve">Un agente es un asistente que además actúa: lee y escribe archivos, corre código, navega, manda</w:t>
+      </w:r>
+      <w:r>
+        <w:t xml:space="preserve"> </w:t>
+      </w:r>
+      <w:r>
+        <w:t xml:space="preserve">mensajes o se conecta a otros sistemas.</w:t>
+      </w:r>
+    </w:p>
     <w:p>
       <w:pPr>
         <w:pStyle w:val="Compact"/>
         <w:numPr>
           <w:ilvl w:val="0"/>
-          <w:numId w:val="1004"/>
+          <w:numId w:val="1005"/>
         </w:numPr>
       </w:pPr>
       <w:r>
-        <w:t xml:space="preserve">Un agente con herramientas de escritura (correo, planillas compartidas, sistemas internos) se</w:t>
-      </w:r>
-      <w:r>
-        <w:t xml:space="preserve"> </w:t>
-      </w:r>
-      <w:r>
-        <w:t xml:space="preserve">usa solo con aprobación previa de [rol], y con una persona que revisa cada acción antes de que</w:t>
-      </w:r>
-      <w:r>
-        <w:t xml:space="preserve"> </w:t>
-      </w:r>
-      <w:r>
-        <w:t xml:space="preserve">ocurra.</w:t>
+        <w:rPr>
+          <w:b/>
+          <w:bCs/>
+        </w:rPr>
+        <w:t xml:space="preserve">Autonomía máxima permitida</w:t>
+      </w:r>
+      <w:r>
+        <w:t xml:space="preserve">: [escalón 3: el agente escribe solo en copias o en tablas de</w:t>
+      </w:r>
+      <w:r>
+        <w:t xml:space="preserve"> </w:t>
+      </w:r>
+      <w:r>
+        <w:t xml:space="preserve">staging; lo que pasa a producción lo aprueba una persona]. Escalones por encima requieren</w:t>
+      </w:r>
+      <w:r>
+        <w:t xml:space="preserve"> </w:t>
+      </w:r>
+      <w:r>
+        <w:t xml:space="preserve">aprobación de [rol].</w:t>
       </w:r>
     </w:p>
     <w:p>
@@ -478,17 +509,205 @@
         <w:pStyle w:val="Compact"/>
         <w:numPr>
           <w:ilvl w:val="0"/>
-          <w:numId w:val="1004"/>
+          <w:numId w:val="1005"/>
         </w:numPr>
       </w:pPr>
       <w:r>
-        <w:t xml:space="preserve">Ningún asistente ni agente se conecta a sistemas de operación o control. Trabajan sobre copias</w:t>
-      </w:r>
-      <w:r>
-        <w:t xml:space="preserve"> </w:t>
-      </w:r>
-      <w:r>
-        <w:t xml:space="preserve">de datos, del lado de la oficina, y producen recomendaciones que una persona ejecuta.</w:t>
+        <w:rPr>
+          <w:b/>
+          <w:bCs/>
+        </w:rPr>
+        <w:t xml:space="preserve">Regla de dos</w:t>
+      </w:r>
+      <w:r>
+        <w:t xml:space="preserve">: sin una persona que apruebe cada acción, un agente tiene como mucho dos de</w:t>
+      </w:r>
+      <w:r>
+        <w:t xml:space="preserve"> </w:t>
+      </w:r>
+      <w:r>
+        <w:t xml:space="preserve">estos tres poderes: leer contenido externo no confiable (web, correos, archivos de terceros),</w:t>
+      </w:r>
+      <w:r>
+        <w:t xml:space="preserve"> </w:t>
+      </w:r>
+      <w:r>
+        <w:t xml:space="preserve">acceder a datos o sistemas sensibles, y actuar o comunicarse hacia afuera.</w:t>
+      </w:r>
+    </w:p>
+    <w:p>
+      <w:pPr>
+        <w:pStyle w:val="Compact"/>
+        <w:numPr>
+          <w:ilvl w:val="0"/>
+          <w:numId w:val="1005"/>
+        </w:numPr>
+      </w:pPr>
+      <w:r>
+        <w:rPr>
+          <w:b/>
+          <w:bCs/>
+        </w:rPr>
+        <w:t xml:space="preserve">Permisos mínimos</w:t>
+      </w:r>
+      <w:r>
+        <w:t xml:space="preserve">: cada agente corre con una cuenta o credencial propia, con los permisos que</w:t>
+      </w:r>
+      <w:r>
+        <w:t xml:space="preserve"> </w:t>
+      </w:r>
+      <w:r>
+        <w:t xml:space="preserve">su tarea necesita y nada más. Ningún agente tiene permisos de borrado sobre bases de producción.</w:t>
+      </w:r>
+      <w:r>
+        <w:t xml:space="preserve"> </w:t>
+      </w:r>
+      <w:r>
+        <w:t xml:space="preserve">Las credenciales no se escriben en el código ni en las instrucciones del agente.</w:t>
+      </w:r>
+    </w:p>
+    <w:p>
+      <w:pPr>
+        <w:pStyle w:val="Compact"/>
+        <w:numPr>
+          <w:ilvl w:val="0"/>
+          <w:numId w:val="1005"/>
+        </w:numPr>
+      </w:pPr>
+      <w:r>
+        <w:rPr>
+          <w:b/>
+          <w:bCs/>
+        </w:rPr>
+        <w:t xml:space="preserve">Validación y revisión</w:t>
+      </w:r>
+      <w:r>
+        <w:t xml:space="preserve">: lo que un agente carga en una base o entrega como resultado pasa por</w:t>
+      </w:r>
+      <w:r>
+        <w:t xml:space="preserve"> </w:t>
+      </w:r>
+      <w:r>
+        <w:t xml:space="preserve">una validación automática (formato, rangos, totales) y por una persona antes de usarse.</w:t>
+      </w:r>
+    </w:p>
+    <w:p>
+      <w:pPr>
+        <w:pStyle w:val="Compact"/>
+        <w:numPr>
+          <w:ilvl w:val="0"/>
+          <w:numId w:val="1005"/>
+        </w:numPr>
+      </w:pPr>
+      <w:r>
+        <w:rPr>
+          <w:b/>
+          <w:bCs/>
+        </w:rPr>
+        <w:t xml:space="preserve">Extensiones y conectores</w:t>
+      </w:r>
+      <w:r>
+        <w:t xml:space="preserve">: solo servidores MCP, extensiones y skills de la lista aprobada</w:t>
+      </w:r>
+      <w:r>
+        <w:t xml:space="preserve"> </w:t>
+      </w:r>
+      <w:r>
+        <w:t xml:space="preserve">por [sistemas], en versiones fijas. Está prohibido desactivar los permisos del agente.</w:t>
+      </w:r>
+    </w:p>
+    <w:p>
+      <w:pPr>
+        <w:pStyle w:val="Compact"/>
+        <w:numPr>
+          <w:ilvl w:val="0"/>
+          <w:numId w:val="1005"/>
+        </w:numPr>
+      </w:pPr>
+      <w:r>
+        <w:rPr>
+          <w:b/>
+          <w:bCs/>
+        </w:rPr>
+        <w:t xml:space="preserve">Registro</w:t>
+      </w:r>
+      <w:r>
+        <w:t xml:space="preserve">: las acciones de cada agente quedan registradas y se revisan [cada mes].</w:t>
+      </w:r>
+    </w:p>
+    <w:p>
+      <w:pPr>
+        <w:pStyle w:val="Compact"/>
+        <w:numPr>
+          <w:ilvl w:val="0"/>
+          <w:numId w:val="1005"/>
+        </w:numPr>
+      </w:pPr>
+      <w:r>
+        <w:rPr>
+          <w:b/>
+          <w:bCs/>
+        </w:rPr>
+        <w:t xml:space="preserve">Responsable</w:t>
+      </w:r>
+      <w:r>
+        <w:t xml:space="preserve">: cada agente tiene un dueño con nombre y cargo, que responde por lo que hace.</w:t>
+      </w:r>
+    </w:p>
+    <w:p>
+      <w:pPr>
+        <w:pStyle w:val="Compact"/>
+        <w:numPr>
+          <w:ilvl w:val="0"/>
+          <w:numId w:val="1005"/>
+        </w:numPr>
+      </w:pPr>
+      <w:r>
+        <w:rPr>
+          <w:b/>
+          <w:bCs/>
+        </w:rPr>
+        <w:t xml:space="preserve">Operación</w:t>
+      </w:r>
+      <w:r>
+        <w:t xml:space="preserve">: ningún asistente ni agente se conecta a sistemas de operación o control (SCADA,</w:t>
+      </w:r>
+      <w:r>
+        <w:t xml:space="preserve"> </w:t>
+      </w:r>
+      <w:r>
+        <w:t xml:space="preserve">controladores, redes de planta). Trabajan sobre copias o réplicas de solo lectura, del lado de</w:t>
+      </w:r>
+      <w:r>
+        <w:t xml:space="preserve"> </w:t>
+      </w:r>
+      <w:r>
+        <w:t xml:space="preserve">la oficina, y producen recomendaciones que una persona ejecuta.</w:t>
+      </w:r>
+    </w:p>
+    <w:p>
+      <w:pPr>
+        <w:pStyle w:val="Compact"/>
+        <w:numPr>
+          <w:ilvl w:val="0"/>
+          <w:numId w:val="1005"/>
+        </w:numPr>
+      </w:pPr>
+      <w:r>
+        <w:rPr>
+          <w:b/>
+          <w:bCs/>
+        </w:rPr>
+        <w:t xml:space="preserve">Antes de arrancar</w:t>
+      </w:r>
+      <w:r>
+        <w:t xml:space="preserve">: todo agente nuevo responde por escrito las diez preguntas de la lista de</w:t>
+      </w:r>
+      <w:r>
+        <w:t xml:space="preserve"> </w:t>
+      </w:r>
+      <w:r>
+        <w:t xml:space="preserve">chequeo [anexo o link], y la firma su responsable.</w:t>
       </w:r>
     </w:p>
     <w:p>
@@ -524,8 +743,8 @@
         <w:t xml:space="preserve">Responsable de la próxima revisión: [nombre] · [fecha].</w:t>
       </w:r>
     </w:p>
-    <w:bookmarkEnd w:id="13"/>
     <w:bookmarkEnd w:id="14"/>
+    <w:bookmarkEnd w:id="15"/>
     <w:sectPr>
       <w:footnotePr>
         <w:numRestart w:val="eachSect"/>
@@ -752,6 +971,9 @@
     <w:abstractNumId w:val="991"/>
   </w:num>
   <w:num w:numId="1004">
+    <w:abstractNumId w:val="991"/>
+  </w:num>
+  <w:num w:numId="1005">
     <w:abstractNumId w:val="991"/>
   </w:num>
 </w:numbering>

</xml_diff>